<commit_message>
feat(controle_attributions): ⑳ A4 apparie la source nommée à son adresse
Le nom (premier segment après « Source : ») doit répondre à une adresse voisine : clé
entière, mot significatif, ou alias d'institution (ANESM/HAS → has-sante.fr, OMS, CEPD,
SERAFIN-PH, PubMed…). Ligne logique recollée puis deux lignes suivantes. Exemptions :
description sans nom propre, référence d'article, source déclarée non consultée (avant
le premier « ; »). Quinze paires unitaires, sept sauvegardes, corpus : 0 bloquant sur 221.

Trois lignes SERAFIN (29/07, 19/08, 09/09) qu'un domaine étranger acquittait : corrigées.

Co-Authored-By: Claude Opus 5 <noreply@anthropic.com>
</commit_message>
<xml_diff>
--- a/sources/veille/2026-07-29_veille_SERAFIN-PH.docx
+++ b/sources/veille/2026-07-29_veille_SERAFIN-PH.docx
@@ -1898,7 +1898,32 @@
           <w:sz w:val="20"/>
           <w:szCs w:val="20"/>
         </w:rPr>
-        <w:t xml:space="preserve">Source : page principale CNSA SERAFIN-PH — décret consulté indirectement via résumé de page ; source primaire (legifrance) non consultée lors de cette veille. À vérifier sur </w:t>
+        <w:t xml:space="preserve">Source : page principale CNSA SERAFIN-PH, </w:t>
+      </w:r>
+      <w:hyperlink w:history="1" r:id="rIdcnsa_page2026">
+        <w:r>
+          <w:rPr>
+            <w:rFonts w:ascii="Calibri" w:cs="Calibri" w:eastAsia="Calibri" w:hAnsi="Calibri"/>
+            <w:i/>
+            <w:iCs/>
+            <w:sz w:val="20"/>
+            <w:szCs w:val="20"/>
+            <w:color w:val="1155CC"/>
+            <w:u w:val="single"/>
+          </w:rPr>
+          <w:t xml:space="preserve">cnsa.fr</w:t>
+        </w:r>
+      </w:hyperlink>
+      <w:r>
+        <w:rPr>
+          <w:rFonts w:ascii="Calibri" w:cs="Calibri" w:eastAsia="Calibri" w:hAnsi="Calibri"/>
+          <w:i/>
+          <w:iCs/>
+          <w:color w:val="6B7280"/>
+          <w:sz w:val="20"/>
+          <w:szCs w:val="20"/>
+        </w:rPr>
+        <w:t xml:space="preserve"> — décret consulté indirectement via résumé de page ; source primaire (legifrance) non consultée lors de cette veille. À vérifier sur </w:t>
       </w:r>
       <w:hyperlink w:history="1" r:id="rIdlegi2026">
         <w:r>
@@ -3661,6 +3686,20 @@
           <w:szCs w:val="22"/>
         </w:rPr>
         <w:t xml:space="preserve">Les quatre chemins du tableau des sources (« cnsa.fr/actualites/recueil-ph-2026 », « fhf.fr/serafin-ph-recueil-2026 », « handicap.gouv.fr/14e-reunion-comite-serafin-ph », « handicap.gouv.fr/comite-strategique-serafin-ph ») n'existaient pas : la note les avait abrégés à sa façon. Ils sont remplacés le 12/09/2026 par le début du vrai chemin de la page liée.</w:t>
+      </w:r>
+    </w:p>
+    <w:p>
+      <w:pPr>
+        <w:spacing w:after="80"/>
+      </w:pPr>
+      <w:r>
+        <w:rPr>
+          <w:rFonts w:ascii="Calibri" w:cs="Calibri" w:eastAsia="Calibri" w:hAnsi="Calibri"/>
+          <w:color w:val="1F2937"/>
+          <w:sz w:val="22"/>
+          <w:szCs w:val="22"/>
+        </w:rPr>
+        <w:t xml:space="preserve">Complément du 12/09/2026 (passe A4, appariement ⑳) : « Source : page principale CNSA SERAFIN-PH — … » n'avait pour adresses voisines que Légifrance, qui n'est pas la source nommée ; cnsa.fr ajouté sur la ligne et lié à la page principale.</w:t>
       </w:r>
     </w:p>
     <w:sectPr>

</xml_diff>